<commit_message>
feat: serial licensing with demo mode, access code lock, QR doc seals, AI agent tools, premium UI
</commit_message>
<xml_diff>
--- a/public/AVENANT_TEMPLATE.docx
+++ b/public/AVENANT_TEMPLATE.docx
@@ -948,6 +948,19 @@
       <w:pgMar w:top="567" w:right="567" w:bottom="567" w:left="567" w:header="284" w:footer="284" w:gutter="0"/>
       <w:cols w:space="720"/>
     </w:sectPr>
+    <w:p>
+      <w:pPr>
+        <w:jc w:val="right"/>
+      </w:pPr>
+      <w:r>
+        <w:rPr>
+          <w:sz w:val="16"/>
+          <w:color w:val="555555"/>
+          <w:rFonts w:ascii="Arial" w:hAnsi="Arial"/>
+        </w:rPr>
+        <w:t>Cachet : [SEAL_CODE]</w:t>
+      </w:r>
+    </w:p>
   </w:body>
 </w:document>
 </file>

</xml_diff>